<commit_message>
agrego avances para el modelo logit
</commit_message>
<xml_diff>
--- a/Variables Hackathon.docx
+++ b/Variables Hackathon.docx
@@ -1088,10 +1088,7 @@
         <w:t xml:space="preserve"> - </w:t>
       </w:r>
       <w:r>
-        <w:t>N (2)</w:t>
-      </w:r>
-      <w:r>
-        <w:t xml:space="preserve"> </w:t>
+        <w:t xml:space="preserve">N (2) </w:t>
       </w:r>
       <w:r>
         <w:t xml:space="preserve">- </w:t>
@@ -1147,6 +1144,9 @@
     </w:p>
     <w:p>
       <w:r>
+        <w:rPr>
+          <w:noProof/>
+        </w:rPr>
         <w:drawing>
           <wp:inline distT="0" distB="0" distL="0" distR="0" wp14:anchorId="090C42F6" wp14:editId="36717D0F">
             <wp:extent cx="5239481" cy="1333686"/>
@@ -1185,7 +1185,15 @@
       </w:r>
     </w:p>
     <w:p>
-      <w:r>
+      <w:pPr>
+        <w:rPr>
+          <w:noProof/>
+        </w:rPr>
+      </w:pPr>
+      <w:r>
+        <w:rPr>
+          <w:noProof/>
+        </w:rPr>
         <w:drawing>
           <wp:inline distT="0" distB="0" distL="0" distR="0" wp14:anchorId="5B0CA72E" wp14:editId="0F76893F">
             <wp:extent cx="5258534" cy="762106"/>
@@ -1229,6 +1237,9 @@
         <w:t xml:space="preserve"> </w:t>
       </w:r>
       <w:r>
+        <w:rPr>
+          <w:noProof/>
+        </w:rPr>
         <w:drawing>
           <wp:inline distT="0" distB="0" distL="0" distR="0" wp14:anchorId="48BA75D6" wp14:editId="34477559">
             <wp:extent cx="5153744" cy="619211"/>
@@ -1266,6 +1277,58 @@
         </w:drawing>
       </w:r>
     </w:p>
+    <w:p>
+      <w:pPr>
+        <w:pStyle w:val="Ttulo1"/>
+        <w:rPr>
+          <w:noProof/>
+        </w:rPr>
+      </w:pPr>
+      <w:r>
+        <w:rPr>
+          <w:noProof/>
+        </w:rPr>
+        <w:t xml:space="preserve">Nuevas variables </w:t>
+      </w:r>
+    </w:p>
+    <w:p>
+      <w:pPr>
+        <w:pStyle w:val="Prrafodelista"/>
+        <w:numPr>
+          <w:ilvl w:val="0"/>
+          <w:numId w:val="7"/>
+        </w:numPr>
+      </w:pPr>
+      <w:r>
+        <w:t>ing_desemp</w:t>
+      </w:r>
+      <w:r>
+        <w:t xml:space="preserve">: 1 cuando cobra </w:t>
+      </w:r>
+      <w:r>
+        <w:t>alguna indemnización o seguro de desempleo</w:t>
+      </w:r>
+      <w:r>
+        <w:t xml:space="preserve"> y 2 cuando no lo hace.</w:t>
+      </w:r>
+    </w:p>
+    <w:p>
+      <w:pPr>
+        <w:pStyle w:val="Prrafodelista"/>
+        <w:numPr>
+          <w:ilvl w:val="0"/>
+          <w:numId w:val="7"/>
+        </w:numPr>
+      </w:pPr>
+      <w:r>
+        <w:lastRenderedPageBreak/>
+        <w:t>ing_t_gub</w:t>
+      </w:r>
+      <w:r>
+        <w:t xml:space="preserve">: </w:t>
+      </w:r>
+    </w:p>
+    <w:p/>
     <w:sectPr>
       <w:pgSz w:w="11906" w:h="16838"/>
       <w:pgMar w:top="1417" w:right="1701" w:bottom="1417" w:left="1701" w:header="708" w:footer="708" w:gutter="0"/>
@@ -1413,6 +1476,92 @@
 <file path=word/numbering.xml><?xml version="1.0" encoding="utf-8"?>
 <w:numbering xmlns:wpc="http://schemas.microsoft.com/office/word/2010/wordprocessingCanvas" xmlns:cx="http://schemas.microsoft.com/office/drawing/2014/chartex" xmlns:cx1="http://schemas.microsoft.com/office/drawing/2015/9/8/chartex" xmlns:cx2="http://schemas.microsoft.com/office/drawing/2015/10/21/chartex" xmlns:cx3="http://schemas.microsoft.com/office/drawing/2016/5/9/chartex" xmlns:cx4="http://schemas.microsoft.com/office/drawing/2016/5/10/chartex" xmlns:cx5="http://schemas.microsoft.com/office/drawing/2016/5/11/chartex" xmlns:cx6="http://schemas.microsoft.com/office/drawing/2016/5/12/chartex" xmlns:cx7="http://schemas.microsoft.com/office/drawing/2016/5/13/chartex" xmlns:cx8="http://schemas.microsoft.com/office/drawing/2016/5/14/chartex" xmlns:mc="http://schemas.openxmlformats.org/markup-compatibility/2006" xmlns:aink="http://schemas.microsoft.com/office/drawing/2016/ink" xmlns:am3d="http://schemas.microsoft.com/office/drawing/2017/model3d" xmlns:o="urn:schemas-microsoft-com:office:office" xmlns:oel="http://schemas.microsoft.com/office/2019/extlst" xmlns:r="http://schemas.openxmlformats.org/officeDocument/2006/relationships" xmlns:m="http://schemas.openxmlformats.org/officeDocument/2006/math" xmlns:v="urn:schemas-microsoft-com:vml" xmlns:wp14="http://schemas.microsoft.com/office/word/2010/wordprocessingDrawing" xmlns:wp="http://schemas.openxmlformats.org/drawingml/2006/wordprocessingDrawing" xmlns:w10="urn:schemas-microsoft-com:office:word" xmlns:w="http://schemas.openxmlformats.org/wordprocessingml/2006/main" xmlns:w14="http://schemas.microsoft.com/office/word/2010/wordml" xmlns:w15="http://schemas.microsoft.com/office/word/2012/wordml" xmlns:w16cex="http://schemas.microsoft.com/office/word/2018/wordml/cex" xmlns:w16cid="http://schemas.microsoft.com/office/word/2016/wordml/cid" xmlns:w16="http://schemas.microsoft.com/office/word/2018/wordml" xmlns:w16du="http://schemas.microsoft.com/office/word/2023/wordml/word16du" xmlns:w16sdtdh="http://schemas.microsoft.com/office/word/2020/wordml/sdtdatahash" xmlns:w16sdtfl="http://schemas.microsoft.com/office/word/2024/wordml/sdtformatlock" xmlns:w16se="http://schemas.microsoft.com/office/word/2015/wordml/symex" xmlns:wpg="http://schemas.microsoft.com/office/word/2010/wordprocessingGroup" xmlns:wpi="http://schemas.microsoft.com/office/word/2010/wordprocessingInk" xmlns:wne="http://schemas.microsoft.com/office/word/2006/wordml" xmlns:wps="http://schemas.microsoft.com/office/word/2010/wordprocessingShape" mc:Ignorable="w14 w15 w16se w16cid w16 w16cex w16sdtdh w16sdtfl w16du wp14">
   <w:abstractNum w:abstractNumId="0" w15:restartNumberingAfterBreak="0">
+    <w:nsid w:val="0FE85832"/>
+    <w:multiLevelType w:val="hybridMultilevel"/>
+    <w:tmpl w:val="78165AAE"/>
+    <w:lvl w:ilvl="0" w:tplc="2C0A000F">
+      <w:start w:val="1"/>
+      <w:numFmt w:val="decimal"/>
+      <w:lvlText w:val="%1."/>
+      <w:lvlJc w:val="left"/>
+      <w:pPr>
+        <w:ind w:left="720" w:hanging="360"/>
+      </w:pPr>
+    </w:lvl>
+    <w:lvl w:ilvl="1" w:tplc="2C0A0019" w:tentative="1">
+      <w:start w:val="1"/>
+      <w:numFmt w:val="lowerLetter"/>
+      <w:lvlText w:val="%2."/>
+      <w:lvlJc w:val="left"/>
+      <w:pPr>
+        <w:ind w:left="1440" w:hanging="360"/>
+      </w:pPr>
+    </w:lvl>
+    <w:lvl w:ilvl="2" w:tplc="2C0A001B" w:tentative="1">
+      <w:start w:val="1"/>
+      <w:numFmt w:val="lowerRoman"/>
+      <w:lvlText w:val="%3."/>
+      <w:lvlJc w:val="right"/>
+      <w:pPr>
+        <w:ind w:left="2160" w:hanging="180"/>
+      </w:pPr>
+    </w:lvl>
+    <w:lvl w:ilvl="3" w:tplc="2C0A000F" w:tentative="1">
+      <w:start w:val="1"/>
+      <w:numFmt w:val="decimal"/>
+      <w:lvlText w:val="%4."/>
+      <w:lvlJc w:val="left"/>
+      <w:pPr>
+        <w:ind w:left="2880" w:hanging="360"/>
+      </w:pPr>
+    </w:lvl>
+    <w:lvl w:ilvl="4" w:tplc="2C0A0019" w:tentative="1">
+      <w:start w:val="1"/>
+      <w:numFmt w:val="lowerLetter"/>
+      <w:lvlText w:val="%5."/>
+      <w:lvlJc w:val="left"/>
+      <w:pPr>
+        <w:ind w:left="3600" w:hanging="360"/>
+      </w:pPr>
+    </w:lvl>
+    <w:lvl w:ilvl="5" w:tplc="2C0A001B" w:tentative="1">
+      <w:start w:val="1"/>
+      <w:numFmt w:val="lowerRoman"/>
+      <w:lvlText w:val="%6."/>
+      <w:lvlJc w:val="right"/>
+      <w:pPr>
+        <w:ind w:left="4320" w:hanging="180"/>
+      </w:pPr>
+    </w:lvl>
+    <w:lvl w:ilvl="6" w:tplc="2C0A000F" w:tentative="1">
+      <w:start w:val="1"/>
+      <w:numFmt w:val="decimal"/>
+      <w:lvlText w:val="%7."/>
+      <w:lvlJc w:val="left"/>
+      <w:pPr>
+        <w:ind w:left="5040" w:hanging="360"/>
+      </w:pPr>
+    </w:lvl>
+    <w:lvl w:ilvl="7" w:tplc="2C0A0019" w:tentative="1">
+      <w:start w:val="1"/>
+      <w:numFmt w:val="lowerLetter"/>
+      <w:lvlText w:val="%8."/>
+      <w:lvlJc w:val="left"/>
+      <w:pPr>
+        <w:ind w:left="5760" w:hanging="360"/>
+      </w:pPr>
+    </w:lvl>
+    <w:lvl w:ilvl="8" w:tplc="2C0A001B" w:tentative="1">
+      <w:start w:val="1"/>
+      <w:numFmt w:val="lowerRoman"/>
+      <w:lvlText w:val="%9."/>
+      <w:lvlJc w:val="right"/>
+      <w:pPr>
+        <w:ind w:left="6480" w:hanging="180"/>
+      </w:pPr>
+    </w:lvl>
+  </w:abstractNum>
+  <w:abstractNum w:abstractNumId="1" w15:restartNumberingAfterBreak="0">
     <w:nsid w:val="2F5B0331"/>
     <w:multiLevelType w:val="hybridMultilevel"/>
     <w:tmpl w:val="4B569B7E"/>
@@ -1525,7 +1674,7 @@
       </w:rPr>
     </w:lvl>
   </w:abstractNum>
-  <w:abstractNum w:abstractNumId="1" w15:restartNumberingAfterBreak="0">
+  <w:abstractNum w:abstractNumId="2" w15:restartNumberingAfterBreak="0">
     <w:nsid w:val="42F3270F"/>
     <w:multiLevelType w:val="hybridMultilevel"/>
     <w:tmpl w:val="3AB489B4"/>
@@ -1638,7 +1787,7 @@
       </w:rPr>
     </w:lvl>
   </w:abstractNum>
-  <w:abstractNum w:abstractNumId="2" w15:restartNumberingAfterBreak="0">
+  <w:abstractNum w:abstractNumId="3" w15:restartNumberingAfterBreak="0">
     <w:nsid w:val="588E1234"/>
     <w:multiLevelType w:val="hybridMultilevel"/>
     <w:tmpl w:val="03BCB4B0"/>
@@ -1751,7 +1900,120 @@
       </w:rPr>
     </w:lvl>
   </w:abstractNum>
-  <w:abstractNum w:abstractNumId="3" w15:restartNumberingAfterBreak="0">
+  <w:abstractNum w:abstractNumId="4" w15:restartNumberingAfterBreak="0">
+    <w:nsid w:val="615E2142"/>
+    <w:multiLevelType w:val="hybridMultilevel"/>
+    <w:tmpl w:val="14F2C5EC"/>
+    <w:lvl w:ilvl="0" w:tplc="2C0A0001">
+      <w:start w:val="1"/>
+      <w:numFmt w:val="bullet"/>
+      <w:lvlText w:val=""/>
+      <w:lvlJc w:val="left"/>
+      <w:pPr>
+        <w:ind w:left="720" w:hanging="360"/>
+      </w:pPr>
+      <w:rPr>
+        <w:rFonts w:ascii="Symbol" w:hAnsi="Symbol" w:hint="default"/>
+      </w:rPr>
+    </w:lvl>
+    <w:lvl w:ilvl="1" w:tplc="2C0A0003" w:tentative="1">
+      <w:start w:val="1"/>
+      <w:numFmt w:val="bullet"/>
+      <w:lvlText w:val="o"/>
+      <w:lvlJc w:val="left"/>
+      <w:pPr>
+        <w:ind w:left="1440" w:hanging="360"/>
+      </w:pPr>
+      <w:rPr>
+        <w:rFonts w:ascii="Courier New" w:hAnsi="Courier New" w:cs="Courier New" w:hint="default"/>
+      </w:rPr>
+    </w:lvl>
+    <w:lvl w:ilvl="2" w:tplc="2C0A0005" w:tentative="1">
+      <w:start w:val="1"/>
+      <w:numFmt w:val="bullet"/>
+      <w:lvlText w:val=""/>
+      <w:lvlJc w:val="left"/>
+      <w:pPr>
+        <w:ind w:left="2160" w:hanging="360"/>
+      </w:pPr>
+      <w:rPr>
+        <w:rFonts w:ascii="Wingdings" w:hAnsi="Wingdings" w:hint="default"/>
+      </w:rPr>
+    </w:lvl>
+    <w:lvl w:ilvl="3" w:tplc="2C0A0001" w:tentative="1">
+      <w:start w:val="1"/>
+      <w:numFmt w:val="bullet"/>
+      <w:lvlText w:val=""/>
+      <w:lvlJc w:val="left"/>
+      <w:pPr>
+        <w:ind w:left="2880" w:hanging="360"/>
+      </w:pPr>
+      <w:rPr>
+        <w:rFonts w:ascii="Symbol" w:hAnsi="Symbol" w:hint="default"/>
+      </w:rPr>
+    </w:lvl>
+    <w:lvl w:ilvl="4" w:tplc="2C0A0003" w:tentative="1">
+      <w:start w:val="1"/>
+      <w:numFmt w:val="bullet"/>
+      <w:lvlText w:val="o"/>
+      <w:lvlJc w:val="left"/>
+      <w:pPr>
+        <w:ind w:left="3600" w:hanging="360"/>
+      </w:pPr>
+      <w:rPr>
+        <w:rFonts w:ascii="Courier New" w:hAnsi="Courier New" w:cs="Courier New" w:hint="default"/>
+      </w:rPr>
+    </w:lvl>
+    <w:lvl w:ilvl="5" w:tplc="2C0A0005" w:tentative="1">
+      <w:start w:val="1"/>
+      <w:numFmt w:val="bullet"/>
+      <w:lvlText w:val=""/>
+      <w:lvlJc w:val="left"/>
+      <w:pPr>
+        <w:ind w:left="4320" w:hanging="360"/>
+      </w:pPr>
+      <w:rPr>
+        <w:rFonts w:ascii="Wingdings" w:hAnsi="Wingdings" w:hint="default"/>
+      </w:rPr>
+    </w:lvl>
+    <w:lvl w:ilvl="6" w:tplc="2C0A0001" w:tentative="1">
+      <w:start w:val="1"/>
+      <w:numFmt w:val="bullet"/>
+      <w:lvlText w:val=""/>
+      <w:lvlJc w:val="left"/>
+      <w:pPr>
+        <w:ind w:left="5040" w:hanging="360"/>
+      </w:pPr>
+      <w:rPr>
+        <w:rFonts w:ascii="Symbol" w:hAnsi="Symbol" w:hint="default"/>
+      </w:rPr>
+    </w:lvl>
+    <w:lvl w:ilvl="7" w:tplc="2C0A0003" w:tentative="1">
+      <w:start w:val="1"/>
+      <w:numFmt w:val="bullet"/>
+      <w:lvlText w:val="o"/>
+      <w:lvlJc w:val="left"/>
+      <w:pPr>
+        <w:ind w:left="5760" w:hanging="360"/>
+      </w:pPr>
+      <w:rPr>
+        <w:rFonts w:ascii="Courier New" w:hAnsi="Courier New" w:cs="Courier New" w:hint="default"/>
+      </w:rPr>
+    </w:lvl>
+    <w:lvl w:ilvl="8" w:tplc="2C0A0005" w:tentative="1">
+      <w:start w:val="1"/>
+      <w:numFmt w:val="bullet"/>
+      <w:lvlText w:val=""/>
+      <w:lvlJc w:val="left"/>
+      <w:pPr>
+        <w:ind w:left="6480" w:hanging="360"/>
+      </w:pPr>
+      <w:rPr>
+        <w:rFonts w:ascii="Wingdings" w:hAnsi="Wingdings" w:hint="default"/>
+      </w:rPr>
+    </w:lvl>
+  </w:abstractNum>
+  <w:abstractNum w:abstractNumId="5" w15:restartNumberingAfterBreak="0">
     <w:nsid w:val="7D353119"/>
     <w:multiLevelType w:val="hybridMultilevel"/>
     <w:tmpl w:val="81A4084A"/>
@@ -1864,7 +2126,7 @@
       </w:rPr>
     </w:lvl>
   </w:abstractNum>
-  <w:abstractNum w:abstractNumId="4" w15:restartNumberingAfterBreak="0">
+  <w:abstractNum w:abstractNumId="6" w15:restartNumberingAfterBreak="0">
     <w:nsid w:val="7E431A7E"/>
     <w:multiLevelType w:val="hybridMultilevel"/>
     <w:tmpl w:val="32AEAEB0"/>
@@ -1978,19 +2240,25 @@
     </w:lvl>
   </w:abstractNum>
   <w:num w:numId="1" w16cid:durableId="1069309636">
+    <w:abstractNumId w:val="3"/>
+  </w:num>
+  <w:num w:numId="2" w16cid:durableId="583416928">
+    <w:abstractNumId w:val="6"/>
+  </w:num>
+  <w:num w:numId="3" w16cid:durableId="1579747314">
+    <w:abstractNumId w:val="5"/>
+  </w:num>
+  <w:num w:numId="4" w16cid:durableId="1762486920">
+    <w:abstractNumId w:val="1"/>
+  </w:num>
+  <w:num w:numId="5" w16cid:durableId="120342080">
     <w:abstractNumId w:val="2"/>
   </w:num>
-  <w:num w:numId="2" w16cid:durableId="583416928">
-    <w:abstractNumId w:val="4"/>
-  </w:num>
-  <w:num w:numId="3" w16cid:durableId="1579747314">
-    <w:abstractNumId w:val="3"/>
-  </w:num>
-  <w:num w:numId="4" w16cid:durableId="1762486920">
+  <w:num w:numId="6" w16cid:durableId="1798329473">
     <w:abstractNumId w:val="0"/>
   </w:num>
-  <w:num w:numId="5" w16cid:durableId="120342080">
-    <w:abstractNumId w:val="1"/>
+  <w:num w:numId="7" w16cid:durableId="1759132134">
+    <w:abstractNumId w:val="4"/>
   </w:num>
 </w:numbering>
 </file>

</xml_diff>